<commit_message>
4.1.2 - 4.1.4 and small overall changes
</commit_message>
<xml_diff>
--- a/Code/Arkhipov/Labs/Lab 12/Report.docx
+++ b/Code/Arkhipov/Labs/Lab 12/Report.docx
@@ -1,10 +1,10 @@
 
 <file path=word/document.xml><?xml version="1.0" encoding="utf-8"?>
-<w:document xmlns:wpc="http://schemas.microsoft.com/office/word/2010/wordprocessingCanvas" xmlns:cx="http://schemas.microsoft.com/office/drawing/2014/chartex" xmlns:cx1="http://schemas.microsoft.com/office/drawing/2015/9/8/chartex" xmlns:cx2="http://schemas.microsoft.com/office/drawing/2015/10/21/chartex" xmlns:cx3="http://schemas.microsoft.com/office/drawing/2016/5/9/chartex" xmlns:cx4="http://schemas.microsoft.com/office/drawing/2016/5/10/chartex" xmlns:cx5="http://schemas.microsoft.com/office/drawing/2016/5/11/chartex" xmlns:cx6="http://schemas.microsoft.com/office/drawing/2016/5/12/chartex" xmlns:cx7="http://schemas.microsoft.com/office/drawing/2016/5/13/chartex" xmlns:cx8="http://schemas.microsoft.com/office/drawing/2016/5/14/chartex" xmlns:mc="http://schemas.openxmlformats.org/markup-compatibility/2006" xmlns:aink="http://schemas.microsoft.com/office/drawing/2016/ink" xmlns:am3d="http://schemas.microsoft.com/office/drawing/2017/model3d" xmlns:o="urn:schemas-microsoft-com:office:office" xmlns:oel="http://schemas.microsoft.com/office/2019/extlst" xmlns:r="http://schemas.openxmlformats.org/officeDocument/2006/relationships" xmlns:m="http://schemas.openxmlformats.org/officeDocument/2006/math" xmlns:v="urn:schemas-microsoft-com:vml" xmlns:wp14="http://schemas.microsoft.com/office/word/2010/wordprocessingDrawing" xmlns:wp="http://schemas.openxmlformats.org/drawingml/2006/wordprocessingDrawing" xmlns:w10="urn:schemas-microsoft-com:office:word" xmlns:w="http://schemas.openxmlformats.org/wordprocessingml/2006/main" xmlns:w14="http://schemas.microsoft.com/office/word/2010/wordml" xmlns:w15="http://schemas.microsoft.com/office/word/2012/wordml" xmlns:w16cex="http://schemas.microsoft.com/office/word/2018/wordml/cex" xmlns:w16cid="http://schemas.microsoft.com/office/word/2016/wordml/cid" xmlns:w16="http://schemas.microsoft.com/office/word/2018/wordml" xmlns:w16du="http://schemas.microsoft.com/office/word/2023/wordml/word16du" xmlns:w16sdtdh="http://schemas.microsoft.com/office/word/2020/wordml/sdtdatahash" xmlns:w16sdtfl="http://schemas.microsoft.com/office/word/2024/wordml/sdtformatlock" xmlns:w16se="http://schemas.microsoft.com/office/word/2015/wordml/symex" xmlns:wpg="http://schemas.microsoft.com/office/word/2010/wordprocessingGroup" xmlns:wpi="http://schemas.microsoft.com/office/word/2010/wordprocessingInk" xmlns:wne="http://schemas.microsoft.com/office/word/2006/wordml" xmlns:wps="http://schemas.microsoft.com/office/word/2010/wordprocessingShape" mc:Ignorable="w14 w15 w16se w16cid w16 w16cex w16sdtdh w16sdtfl w16du wp14">
+<w:document xmlns:wpc="http://schemas.microsoft.com/office/word/2010/wordprocessingCanvas" xmlns:cx="http://schemas.microsoft.com/office/drawing/2014/chartex" xmlns:cx1="http://schemas.microsoft.com/office/drawing/2015/9/8/chartex" xmlns:mc="http://schemas.openxmlformats.org/markup-compatibility/2006" xmlns:o="urn:schemas-microsoft-com:office:office" xmlns:r="http://schemas.openxmlformats.org/officeDocument/2006/relationships" xmlns:m="http://schemas.openxmlformats.org/officeDocument/2006/math" xmlns:v="urn:schemas-microsoft-com:vml" xmlns:wp14="http://schemas.microsoft.com/office/word/2010/wordprocessingDrawing" xmlns:wp="http://schemas.openxmlformats.org/drawingml/2006/wordprocessingDrawing" xmlns:w10="urn:schemas-microsoft-com:office:word" xmlns:w="http://schemas.openxmlformats.org/wordprocessingml/2006/main" xmlns:w14="http://schemas.microsoft.com/office/word/2010/wordml" xmlns:w15="http://schemas.microsoft.com/office/word/2012/wordml" xmlns:w16se="http://schemas.microsoft.com/office/word/2015/wordml/symex" xmlns:wpg="http://schemas.microsoft.com/office/word/2010/wordprocessingGroup" xmlns:wpi="http://schemas.microsoft.com/office/word/2010/wordprocessingInk" xmlns:wne="http://schemas.microsoft.com/office/word/2006/wordml" xmlns:wps="http://schemas.microsoft.com/office/word/2010/wordprocessingShape" mc:Ignorable="w14 w15 w16se wp14">
   <w:body>
     <w:p>
       <w:pPr>
-        <w:spacing w:before="5000" w:after="0" w:line="240" w:lineRule="auto"/>
+        <w:spacing w:before="4000" w:after="0" w:line="240" w:lineRule="auto"/>
         <w:jc w:val="center"/>
         <w:rPr>
           <w:rFonts w:ascii="Times New Roman" w:hAnsi="Times New Roman" w:cs="Times New Roman"/>
@@ -14,6 +14,7 @@
           <w:szCs w:val="32"/>
         </w:rPr>
       </w:pPr>
+      <w:bookmarkStart w:id="0" w:name="_GoBack"/>
       <w:r>
         <w:rPr>
           <w:rFonts w:ascii="Times New Roman" w:hAnsi="Times New Roman" w:cs="Times New Roman"/>
@@ -60,7 +61,25 @@
           <w:sz w:val="32"/>
           <w:szCs w:val="32"/>
         </w:rPr>
-        <w:t>Студента группы Исс 24-1</w:t>
+        <w:t xml:space="preserve">Студента группы </w:t>
+      </w:r>
+      <w:proofErr w:type="spellStart"/>
+      <w:r>
+        <w:rPr>
+          <w:rFonts w:ascii="Times New Roman" w:hAnsi="Times New Roman" w:cs="Times New Roman"/>
+          <w:sz w:val="32"/>
+          <w:szCs w:val="32"/>
+        </w:rPr>
+        <w:t>Исс</w:t>
+      </w:r>
+      <w:proofErr w:type="spellEnd"/>
+      <w:r>
+        <w:rPr>
+          <w:rFonts w:ascii="Times New Roman" w:hAnsi="Times New Roman" w:cs="Times New Roman"/>
+          <w:sz w:val="32"/>
+          <w:szCs w:val="32"/>
+        </w:rPr>
+        <w:t xml:space="preserve"> 24-1</w:t>
       </w:r>
       <w:r>
         <w:rPr>
@@ -78,7 +97,25 @@
           <w:sz w:val="32"/>
           <w:szCs w:val="32"/>
         </w:rPr>
-        <w:t>ГБУ КО ПОО «КИТиС»</w:t>
+        <w:t>ГБУ КО ПОО «</w:t>
+      </w:r>
+      <w:proofErr w:type="spellStart"/>
+      <w:r>
+        <w:rPr>
+          <w:rFonts w:ascii="Times New Roman" w:hAnsi="Times New Roman" w:cs="Times New Roman"/>
+          <w:sz w:val="32"/>
+          <w:szCs w:val="32"/>
+        </w:rPr>
+        <w:t>КИТиС</w:t>
+      </w:r>
+      <w:proofErr w:type="spellEnd"/>
+      <w:r>
+        <w:rPr>
+          <w:rFonts w:ascii="Times New Roman" w:hAnsi="Times New Roman" w:cs="Times New Roman"/>
+          <w:sz w:val="32"/>
+          <w:szCs w:val="32"/>
+        </w:rPr>
+        <w:t>»</w:t>
       </w:r>
       <w:r>
         <w:rPr>
@@ -119,6 +156,7 @@
         <w:t>Вариант 2</w:t>
       </w:r>
     </w:p>
+    <w:bookmarkEnd w:id="0"/>
     <w:p>
       <w:pPr>
         <w:spacing w:after="0" w:line="240" w:lineRule="auto"/>
@@ -240,18 +278,38 @@
           <w:rFonts w:ascii="Courier New" w:hAnsi="Courier New" w:cs="Courier New"/>
           <w:sz w:val="18"/>
           <w:szCs w:val="18"/>
-          <w:lang w:val="en-US"/>
-        </w:rPr>
-      </w:pPr>
-      <w:r>
-        <w:rPr>
-          <w:rFonts w:ascii="Courier New" w:hAnsi="Courier New" w:cs="Courier New"/>
-          <w:sz w:val="18"/>
-          <w:szCs w:val="18"/>
-          <w:lang w:val="en-US"/>
-        </w:rPr>
-        <w:t>import json</w:t>
-      </w:r>
+        </w:rPr>
+      </w:pPr>
+      <w:proofErr w:type="gramStart"/>
+      <w:r>
+        <w:rPr>
+          <w:rFonts w:ascii="Courier New" w:hAnsi="Courier New" w:cs="Courier New"/>
+          <w:sz w:val="18"/>
+          <w:szCs w:val="18"/>
+          <w:lang w:val="en-US"/>
+        </w:rPr>
+        <w:t>import</w:t>
+      </w:r>
+      <w:proofErr w:type="gramEnd"/>
+      <w:r>
+        <w:rPr>
+          <w:rFonts w:ascii="Courier New" w:hAnsi="Courier New" w:cs="Courier New"/>
+          <w:sz w:val="18"/>
+          <w:szCs w:val="18"/>
+        </w:rPr>
+        <w:t xml:space="preserve"> </w:t>
+      </w:r>
+      <w:proofErr w:type="spellStart"/>
+      <w:r>
+        <w:rPr>
+          <w:rFonts w:ascii="Courier New" w:hAnsi="Courier New" w:cs="Courier New"/>
+          <w:sz w:val="18"/>
+          <w:szCs w:val="18"/>
+          <w:lang w:val="en-US"/>
+        </w:rPr>
+        <w:t>json</w:t>
+      </w:r>
+      <w:proofErr w:type="spellEnd"/>
     </w:p>
     <w:p>
       <w:pPr>
@@ -266,17 +324,69 @@
           <w:rFonts w:ascii="Courier New" w:hAnsi="Courier New" w:cs="Courier New"/>
           <w:sz w:val="18"/>
           <w:szCs w:val="18"/>
-          <w:lang w:val="en-US"/>
-        </w:rPr>
-      </w:pPr>
-      <w:r>
-        <w:rPr>
-          <w:rFonts w:ascii="Courier New" w:hAnsi="Courier New" w:cs="Courier New"/>
-          <w:sz w:val="18"/>
-          <w:szCs w:val="18"/>
-          <w:lang w:val="en-US"/>
-        </w:rPr>
-        <w:t>import random as r</w:t>
+        </w:rPr>
+      </w:pPr>
+      <w:proofErr w:type="gramStart"/>
+      <w:r>
+        <w:rPr>
+          <w:rFonts w:ascii="Courier New" w:hAnsi="Courier New" w:cs="Courier New"/>
+          <w:sz w:val="18"/>
+          <w:szCs w:val="18"/>
+          <w:lang w:val="en-US"/>
+        </w:rPr>
+        <w:t>import</w:t>
+      </w:r>
+      <w:proofErr w:type="gramEnd"/>
+      <w:r>
+        <w:rPr>
+          <w:rFonts w:ascii="Courier New" w:hAnsi="Courier New" w:cs="Courier New"/>
+          <w:sz w:val="18"/>
+          <w:szCs w:val="18"/>
+        </w:rPr>
+        <w:t xml:space="preserve"> </w:t>
+      </w:r>
+      <w:r>
+        <w:rPr>
+          <w:rFonts w:ascii="Courier New" w:hAnsi="Courier New" w:cs="Courier New"/>
+          <w:sz w:val="18"/>
+          <w:szCs w:val="18"/>
+          <w:lang w:val="en-US"/>
+        </w:rPr>
+        <w:t>random</w:t>
+      </w:r>
+      <w:r>
+        <w:rPr>
+          <w:rFonts w:ascii="Courier New" w:hAnsi="Courier New" w:cs="Courier New"/>
+          <w:sz w:val="18"/>
+          <w:szCs w:val="18"/>
+        </w:rPr>
+        <w:t xml:space="preserve"> </w:t>
+      </w:r>
+      <w:r>
+        <w:rPr>
+          <w:rFonts w:ascii="Courier New" w:hAnsi="Courier New" w:cs="Courier New"/>
+          <w:sz w:val="18"/>
+          <w:szCs w:val="18"/>
+          <w:lang w:val="en-US"/>
+        </w:rPr>
+        <w:t>as</w:t>
+      </w:r>
+      <w:r>
+        <w:rPr>
+          <w:rFonts w:ascii="Courier New" w:hAnsi="Courier New" w:cs="Courier New"/>
+          <w:sz w:val="18"/>
+          <w:szCs w:val="18"/>
+        </w:rPr>
+        <w:t xml:space="preserve"> </w:t>
+      </w:r>
+      <w:r>
+        <w:rPr>
+          <w:rFonts w:ascii="Courier New" w:hAnsi="Courier New" w:cs="Courier New"/>
+          <w:sz w:val="18"/>
+          <w:szCs w:val="18"/>
+          <w:lang w:val="en-US"/>
+        </w:rPr>
+        <w:t>r</w:t>
       </w:r>
     </w:p>
     <w:p>
@@ -295,14 +405,45 @@
           <w:lang w:val="en-US"/>
         </w:rPr>
       </w:pPr>
-      <w:r>
-        <w:rPr>
-          <w:rFonts w:ascii="Courier New" w:hAnsi="Courier New" w:cs="Courier New"/>
-          <w:sz w:val="18"/>
-          <w:szCs w:val="18"/>
-          <w:lang w:val="en-US"/>
-        </w:rPr>
-        <w:t>from pathlib import Path</w:t>
+      <w:proofErr w:type="gramStart"/>
+      <w:r>
+        <w:rPr>
+          <w:rFonts w:ascii="Courier New" w:hAnsi="Courier New" w:cs="Courier New"/>
+          <w:sz w:val="18"/>
+          <w:szCs w:val="18"/>
+          <w:lang w:val="en-US"/>
+        </w:rPr>
+        <w:t>from</w:t>
+      </w:r>
+      <w:proofErr w:type="gramEnd"/>
+      <w:r>
+        <w:rPr>
+          <w:rFonts w:ascii="Courier New" w:hAnsi="Courier New" w:cs="Courier New"/>
+          <w:sz w:val="18"/>
+          <w:szCs w:val="18"/>
+          <w:lang w:val="en-US"/>
+        </w:rPr>
+        <w:t xml:space="preserve"> </w:t>
+      </w:r>
+      <w:proofErr w:type="spellStart"/>
+      <w:r>
+        <w:rPr>
+          <w:rFonts w:ascii="Courier New" w:hAnsi="Courier New" w:cs="Courier New"/>
+          <w:sz w:val="18"/>
+          <w:szCs w:val="18"/>
+          <w:lang w:val="en-US"/>
+        </w:rPr>
+        <w:t>pathlib</w:t>
+      </w:r>
+      <w:proofErr w:type="spellEnd"/>
+      <w:r>
+        <w:rPr>
+          <w:rFonts w:ascii="Courier New" w:hAnsi="Courier New" w:cs="Courier New"/>
+          <w:sz w:val="18"/>
+          <w:szCs w:val="18"/>
+          <w:lang w:val="en-US"/>
+        </w:rPr>
+        <w:t xml:space="preserve"> import Path</w:t>
       </w:r>
     </w:p>
     <w:p>
@@ -345,8 +486,19 @@
           <w:szCs w:val="18"/>
           <w:lang w:val="en-US"/>
         </w:rPr>
-        <w:t># Конфигурации</w:t>
-      </w:r>
+        <w:t xml:space="preserve"># </w:t>
+      </w:r>
+      <w:proofErr w:type="spellStart"/>
+      <w:r>
+        <w:rPr>
+          <w:rFonts w:ascii="Courier New" w:hAnsi="Courier New" w:cs="Courier New"/>
+          <w:sz w:val="18"/>
+          <w:szCs w:val="18"/>
+          <w:lang w:val="en-US"/>
+        </w:rPr>
+        <w:t>Конфигурации</w:t>
+      </w:r>
+      <w:proofErr w:type="spellEnd"/>
     </w:p>
     <w:p>
       <w:pPr>
@@ -364,14 +516,45 @@
           <w:lang w:val="en-US"/>
         </w:rPr>
       </w:pPr>
-      <w:r>
-        <w:rPr>
-          <w:rFonts w:ascii="Courier New" w:hAnsi="Courier New" w:cs="Courier New"/>
-          <w:sz w:val="18"/>
-          <w:szCs w:val="18"/>
-          <w:lang w:val="en-US"/>
-        </w:rPr>
-        <w:t>file_name = "LabData.json"</w:t>
+      <w:proofErr w:type="spellStart"/>
+      <w:r>
+        <w:rPr>
+          <w:rFonts w:ascii="Courier New" w:hAnsi="Courier New" w:cs="Courier New"/>
+          <w:sz w:val="18"/>
+          <w:szCs w:val="18"/>
+          <w:lang w:val="en-US"/>
+        </w:rPr>
+        <w:t>file_name</w:t>
+      </w:r>
+      <w:proofErr w:type="spellEnd"/>
+      <w:r>
+        <w:rPr>
+          <w:rFonts w:ascii="Courier New" w:hAnsi="Courier New" w:cs="Courier New"/>
+          <w:sz w:val="18"/>
+          <w:szCs w:val="18"/>
+          <w:lang w:val="en-US"/>
+        </w:rPr>
+        <w:t xml:space="preserve"> = "</w:t>
+      </w:r>
+      <w:proofErr w:type="spellStart"/>
+      <w:r>
+        <w:rPr>
+          <w:rFonts w:ascii="Courier New" w:hAnsi="Courier New" w:cs="Courier New"/>
+          <w:sz w:val="18"/>
+          <w:szCs w:val="18"/>
+          <w:lang w:val="en-US"/>
+        </w:rPr>
+        <w:t>LabData.json</w:t>
+      </w:r>
+      <w:proofErr w:type="spellEnd"/>
+      <w:r>
+        <w:rPr>
+          <w:rFonts w:ascii="Courier New" w:hAnsi="Courier New" w:cs="Courier New"/>
+          <w:sz w:val="18"/>
+          <w:szCs w:val="18"/>
+          <w:lang w:val="en-US"/>
+        </w:rPr>
+        <w:t>"</w:t>
       </w:r>
     </w:p>
     <w:p>
@@ -397,7 +580,27 @@
           <w:szCs w:val="18"/>
           <w:lang w:val="en-US"/>
         </w:rPr>
-        <w:t>CWD: Path = Path(__file__).resolve().parent</w:t>
+        <w:t xml:space="preserve">CWD: Path = </w:t>
+      </w:r>
+      <w:proofErr w:type="gramStart"/>
+      <w:r>
+        <w:rPr>
+          <w:rFonts w:ascii="Courier New" w:hAnsi="Courier New" w:cs="Courier New"/>
+          <w:sz w:val="18"/>
+          <w:szCs w:val="18"/>
+          <w:lang w:val="en-US"/>
+        </w:rPr>
+        <w:t>Path(</w:t>
+      </w:r>
+      <w:proofErr w:type="gramEnd"/>
+      <w:r>
+        <w:rPr>
+          <w:rFonts w:ascii="Courier New" w:hAnsi="Courier New" w:cs="Courier New"/>
+          <w:sz w:val="18"/>
+          <w:szCs w:val="18"/>
+          <w:lang w:val="en-US"/>
+        </w:rPr>
+        <w:t>__file__).resolve().parent</w:t>
       </w:r>
     </w:p>
     <w:p>
@@ -416,15 +619,37 @@
           <w:lang w:val="en-US"/>
         </w:rPr>
       </w:pPr>
-      <w:r>
-        <w:rPr>
-          <w:rFonts w:ascii="Courier New" w:hAnsi="Courier New" w:cs="Courier New"/>
-          <w:sz w:val="18"/>
-          <w:szCs w:val="18"/>
-          <w:lang w:val="en-US"/>
-        </w:rPr>
-        <w:t>file_path: Path = CWD / file_name</w:t>
-      </w:r>
+      <w:proofErr w:type="spellStart"/>
+      <w:r>
+        <w:rPr>
+          <w:rFonts w:ascii="Courier New" w:hAnsi="Courier New" w:cs="Courier New"/>
+          <w:sz w:val="18"/>
+          <w:szCs w:val="18"/>
+          <w:lang w:val="en-US"/>
+        </w:rPr>
+        <w:t>file_path</w:t>
+      </w:r>
+      <w:proofErr w:type="spellEnd"/>
+      <w:r>
+        <w:rPr>
+          <w:rFonts w:ascii="Courier New" w:hAnsi="Courier New" w:cs="Courier New"/>
+          <w:sz w:val="18"/>
+          <w:szCs w:val="18"/>
+          <w:lang w:val="en-US"/>
+        </w:rPr>
+        <w:t xml:space="preserve">: Path = CWD / </w:t>
+      </w:r>
+      <w:proofErr w:type="spellStart"/>
+      <w:r>
+        <w:rPr>
+          <w:rFonts w:ascii="Courier New" w:hAnsi="Courier New" w:cs="Courier New"/>
+          <w:sz w:val="18"/>
+          <w:szCs w:val="18"/>
+          <w:lang w:val="en-US"/>
+        </w:rPr>
+        <w:t>file_name</w:t>
+      </w:r>
+      <w:proofErr w:type="spellEnd"/>
     </w:p>
     <w:p>
       <w:pPr>
@@ -442,14 +667,25 @@
           <w:lang w:val="en-US"/>
         </w:rPr>
       </w:pPr>
-      <w:r>
-        <w:rPr>
-          <w:rFonts w:ascii="Courier New" w:hAnsi="Courier New" w:cs="Courier New"/>
-          <w:sz w:val="18"/>
-          <w:szCs w:val="18"/>
-          <w:lang w:val="en-US"/>
-        </w:rPr>
-        <w:t>encoding = "utf-8"</w:t>
+      <w:proofErr w:type="gramStart"/>
+      <w:r>
+        <w:rPr>
+          <w:rFonts w:ascii="Courier New" w:hAnsi="Courier New" w:cs="Courier New"/>
+          <w:sz w:val="18"/>
+          <w:szCs w:val="18"/>
+          <w:lang w:val="en-US"/>
+        </w:rPr>
+        <w:t>encoding</w:t>
+      </w:r>
+      <w:proofErr w:type="gramEnd"/>
+      <w:r>
+        <w:rPr>
+          <w:rFonts w:ascii="Courier New" w:hAnsi="Courier New" w:cs="Courier New"/>
+          <w:sz w:val="18"/>
+          <w:szCs w:val="18"/>
+          <w:lang w:val="en-US"/>
+        </w:rPr>
+        <w:t xml:space="preserve"> = "utf-8"</w:t>
       </w:r>
     </w:p>
     <w:p>
@@ -492,8 +728,39 @@
           <w:szCs w:val="18"/>
           <w:lang w:val="en-US"/>
         </w:rPr>
-        <w:t># Генерация файла</w:t>
-      </w:r>
+        <w:t xml:space="preserve"># </w:t>
+      </w:r>
+      <w:proofErr w:type="spellStart"/>
+      <w:r>
+        <w:rPr>
+          <w:rFonts w:ascii="Courier New" w:hAnsi="Courier New" w:cs="Courier New"/>
+          <w:sz w:val="18"/>
+          <w:szCs w:val="18"/>
+          <w:lang w:val="en-US"/>
+        </w:rPr>
+        <w:t>Генерация</w:t>
+      </w:r>
+      <w:proofErr w:type="spellEnd"/>
+      <w:r>
+        <w:rPr>
+          <w:rFonts w:ascii="Courier New" w:hAnsi="Courier New" w:cs="Courier New"/>
+          <w:sz w:val="18"/>
+          <w:szCs w:val="18"/>
+          <w:lang w:val="en-US"/>
+        </w:rPr>
+        <w:t xml:space="preserve"> </w:t>
+      </w:r>
+      <w:proofErr w:type="spellStart"/>
+      <w:r>
+        <w:rPr>
+          <w:rFonts w:ascii="Courier New" w:hAnsi="Courier New" w:cs="Courier New"/>
+          <w:sz w:val="18"/>
+          <w:szCs w:val="18"/>
+          <w:lang w:val="en-US"/>
+        </w:rPr>
+        <w:t>файла</w:t>
+      </w:r>
+      <w:proofErr w:type="spellEnd"/>
     </w:p>
     <w:p>
       <w:pPr>
@@ -518,7 +785,47 @@
           <w:szCs w:val="18"/>
           <w:lang w:val="en-US"/>
         </w:rPr>
-        <w:t>FloatList1: list[float] = [round(r.uniform(1, 10), 2) for _ in range(10)]</w:t>
+        <w:t xml:space="preserve">FloatList1: </w:t>
+      </w:r>
+      <w:proofErr w:type="gramStart"/>
+      <w:r>
+        <w:rPr>
+          <w:rFonts w:ascii="Courier New" w:hAnsi="Courier New" w:cs="Courier New"/>
+          <w:sz w:val="18"/>
+          <w:szCs w:val="18"/>
+          <w:lang w:val="en-US"/>
+        </w:rPr>
+        <w:t>list[</w:t>
+      </w:r>
+      <w:proofErr w:type="gramEnd"/>
+      <w:r>
+        <w:rPr>
+          <w:rFonts w:ascii="Courier New" w:hAnsi="Courier New" w:cs="Courier New"/>
+          <w:sz w:val="18"/>
+          <w:szCs w:val="18"/>
+          <w:lang w:val="en-US"/>
+        </w:rPr>
+        <w:t>float] = [round(</w:t>
+      </w:r>
+      <w:proofErr w:type="spellStart"/>
+      <w:r>
+        <w:rPr>
+          <w:rFonts w:ascii="Courier New" w:hAnsi="Courier New" w:cs="Courier New"/>
+          <w:sz w:val="18"/>
+          <w:szCs w:val="18"/>
+          <w:lang w:val="en-US"/>
+        </w:rPr>
+        <w:t>r.uniform</w:t>
+      </w:r>
+      <w:proofErr w:type="spellEnd"/>
+      <w:r>
+        <w:rPr>
+          <w:rFonts w:ascii="Courier New" w:hAnsi="Courier New" w:cs="Courier New"/>
+          <w:sz w:val="18"/>
+          <w:szCs w:val="18"/>
+          <w:lang w:val="en-US"/>
+        </w:rPr>
+        <w:t>(1, 10), 2) for _ in range(10)]</w:t>
       </w:r>
     </w:p>
     <w:p>
@@ -537,15 +844,37 @@
           <w:lang w:val="en-US"/>
         </w:rPr>
       </w:pPr>
-      <w:r>
-        <w:rPr>
-          <w:rFonts w:ascii="Courier New" w:hAnsi="Courier New" w:cs="Courier New"/>
-          <w:sz w:val="18"/>
-          <w:szCs w:val="18"/>
-          <w:lang w:val="en-US"/>
-        </w:rPr>
-        <w:t>file_path.write_text(</w:t>
-      </w:r>
+      <w:proofErr w:type="spellStart"/>
+      <w:r>
+        <w:rPr>
+          <w:rFonts w:ascii="Courier New" w:hAnsi="Courier New" w:cs="Courier New"/>
+          <w:sz w:val="18"/>
+          <w:szCs w:val="18"/>
+          <w:lang w:val="en-US"/>
+        </w:rPr>
+        <w:t>file_path.write_</w:t>
+      </w:r>
+      <w:proofErr w:type="gramStart"/>
+      <w:r>
+        <w:rPr>
+          <w:rFonts w:ascii="Courier New" w:hAnsi="Courier New" w:cs="Courier New"/>
+          <w:sz w:val="18"/>
+          <w:szCs w:val="18"/>
+          <w:lang w:val="en-US"/>
+        </w:rPr>
+        <w:t>text</w:t>
+      </w:r>
+      <w:proofErr w:type="spellEnd"/>
+      <w:r>
+        <w:rPr>
+          <w:rFonts w:ascii="Courier New" w:hAnsi="Courier New" w:cs="Courier New"/>
+          <w:sz w:val="18"/>
+          <w:szCs w:val="18"/>
+          <w:lang w:val="en-US"/>
+        </w:rPr>
+        <w:t>(</w:t>
+      </w:r>
+      <w:proofErr w:type="gramEnd"/>
     </w:p>
     <w:p>
       <w:pPr>
@@ -570,7 +899,38 @@
           <w:szCs w:val="18"/>
           <w:lang w:val="en-US"/>
         </w:rPr>
-        <w:t>    json.dumps({"FloatList1": FloatList1}, indent=2), encoding=encoding</w:t>
+        <w:t xml:space="preserve">    </w:t>
+      </w:r>
+      <w:proofErr w:type="spellStart"/>
+      <w:proofErr w:type="gramStart"/>
+      <w:r>
+        <w:rPr>
+          <w:rFonts w:ascii="Courier New" w:hAnsi="Courier New" w:cs="Courier New"/>
+          <w:sz w:val="18"/>
+          <w:szCs w:val="18"/>
+          <w:lang w:val="en-US"/>
+        </w:rPr>
+        <w:t>json.dumps</w:t>
+      </w:r>
+      <w:proofErr w:type="spellEnd"/>
+      <w:r>
+        <w:rPr>
+          <w:rFonts w:ascii="Courier New" w:hAnsi="Courier New" w:cs="Courier New"/>
+          <w:sz w:val="18"/>
+          <w:szCs w:val="18"/>
+          <w:lang w:val="en-US"/>
+        </w:rPr>
+        <w:t>(</w:t>
+      </w:r>
+      <w:proofErr w:type="gramEnd"/>
+      <w:r>
+        <w:rPr>
+          <w:rFonts w:ascii="Courier New" w:hAnsi="Courier New" w:cs="Courier New"/>
+          <w:sz w:val="18"/>
+          <w:szCs w:val="18"/>
+          <w:lang w:val="en-US"/>
+        </w:rPr>
+        <w:t>{"FloatList1": FloatList1}, indent=2), encoding=encoding</w:t>
       </w:r>
     </w:p>
     <w:p>
@@ -639,8 +999,39 @@
           <w:szCs w:val="18"/>
           <w:lang w:val="en-US"/>
         </w:rPr>
-        <w:t># Изменение файла</w:t>
-      </w:r>
+        <w:t xml:space="preserve"># </w:t>
+      </w:r>
+      <w:proofErr w:type="spellStart"/>
+      <w:r>
+        <w:rPr>
+          <w:rFonts w:ascii="Courier New" w:hAnsi="Courier New" w:cs="Courier New"/>
+          <w:sz w:val="18"/>
+          <w:szCs w:val="18"/>
+          <w:lang w:val="en-US"/>
+        </w:rPr>
+        <w:t>Изменение</w:t>
+      </w:r>
+      <w:proofErr w:type="spellEnd"/>
+      <w:r>
+        <w:rPr>
+          <w:rFonts w:ascii="Courier New" w:hAnsi="Courier New" w:cs="Courier New"/>
+          <w:sz w:val="18"/>
+          <w:szCs w:val="18"/>
+          <w:lang w:val="en-US"/>
+        </w:rPr>
+        <w:t xml:space="preserve"> </w:t>
+      </w:r>
+      <w:proofErr w:type="spellStart"/>
+      <w:r>
+        <w:rPr>
+          <w:rFonts w:ascii="Courier New" w:hAnsi="Courier New" w:cs="Courier New"/>
+          <w:sz w:val="18"/>
+          <w:szCs w:val="18"/>
+          <w:lang w:val="en-US"/>
+        </w:rPr>
+        <w:t>файла</w:t>
+      </w:r>
+      <w:proofErr w:type="spellEnd"/>
     </w:p>
     <w:p>
       <w:pPr>
@@ -658,14 +1049,105 @@
           <w:lang w:val="en-US"/>
         </w:rPr>
       </w:pPr>
-      <w:r>
-        <w:rPr>
-          <w:rFonts w:ascii="Courier New" w:hAnsi="Courier New" w:cs="Courier New"/>
-          <w:sz w:val="18"/>
-          <w:szCs w:val="18"/>
-          <w:lang w:val="en-US"/>
-        </w:rPr>
-        <w:t>data: dict[str, list[float]] = json.loads(file_path.read_text(encoding=encoding))</w:t>
+      <w:proofErr w:type="gramStart"/>
+      <w:r>
+        <w:rPr>
+          <w:rFonts w:ascii="Courier New" w:hAnsi="Courier New" w:cs="Courier New"/>
+          <w:sz w:val="18"/>
+          <w:szCs w:val="18"/>
+          <w:lang w:val="en-US"/>
+        </w:rPr>
+        <w:t>data</w:t>
+      </w:r>
+      <w:proofErr w:type="gramEnd"/>
+      <w:r>
+        <w:rPr>
+          <w:rFonts w:ascii="Courier New" w:hAnsi="Courier New" w:cs="Courier New"/>
+          <w:sz w:val="18"/>
+          <w:szCs w:val="18"/>
+          <w:lang w:val="en-US"/>
+        </w:rPr>
+        <w:t xml:space="preserve">: </w:t>
+      </w:r>
+      <w:proofErr w:type="spellStart"/>
+      <w:r>
+        <w:rPr>
+          <w:rFonts w:ascii="Courier New" w:hAnsi="Courier New" w:cs="Courier New"/>
+          <w:sz w:val="18"/>
+          <w:szCs w:val="18"/>
+          <w:lang w:val="en-US"/>
+        </w:rPr>
+        <w:t>dict</w:t>
+      </w:r>
+      <w:proofErr w:type="spellEnd"/>
+      <w:r>
+        <w:rPr>
+          <w:rFonts w:ascii="Courier New" w:hAnsi="Courier New" w:cs="Courier New"/>
+          <w:sz w:val="18"/>
+          <w:szCs w:val="18"/>
+          <w:lang w:val="en-US"/>
+        </w:rPr>
+        <w:t>[</w:t>
+      </w:r>
+      <w:proofErr w:type="spellStart"/>
+      <w:r>
+        <w:rPr>
+          <w:rFonts w:ascii="Courier New" w:hAnsi="Courier New" w:cs="Courier New"/>
+          <w:sz w:val="18"/>
+          <w:szCs w:val="18"/>
+          <w:lang w:val="en-US"/>
+        </w:rPr>
+        <w:t>str</w:t>
+      </w:r>
+      <w:proofErr w:type="spellEnd"/>
+      <w:r>
+        <w:rPr>
+          <w:rFonts w:ascii="Courier New" w:hAnsi="Courier New" w:cs="Courier New"/>
+          <w:sz w:val="18"/>
+          <w:szCs w:val="18"/>
+          <w:lang w:val="en-US"/>
+        </w:rPr>
+        <w:t xml:space="preserve">, list[float]] = </w:t>
+      </w:r>
+      <w:proofErr w:type="spellStart"/>
+      <w:r>
+        <w:rPr>
+          <w:rFonts w:ascii="Courier New" w:hAnsi="Courier New" w:cs="Courier New"/>
+          <w:sz w:val="18"/>
+          <w:szCs w:val="18"/>
+          <w:lang w:val="en-US"/>
+        </w:rPr>
+        <w:t>json.loads</w:t>
+      </w:r>
+      <w:proofErr w:type="spellEnd"/>
+      <w:r>
+        <w:rPr>
+          <w:rFonts w:ascii="Courier New" w:hAnsi="Courier New" w:cs="Courier New"/>
+          <w:sz w:val="18"/>
+          <w:szCs w:val="18"/>
+          <w:lang w:val="en-US"/>
+        </w:rPr>
+        <w:t>(</w:t>
+      </w:r>
+      <w:proofErr w:type="spellStart"/>
+      <w:r>
+        <w:rPr>
+          <w:rFonts w:ascii="Courier New" w:hAnsi="Courier New" w:cs="Courier New"/>
+          <w:sz w:val="18"/>
+          <w:szCs w:val="18"/>
+          <w:lang w:val="en-US"/>
+        </w:rPr>
+        <w:t>file_path.read_text</w:t>
+      </w:r>
+      <w:proofErr w:type="spellEnd"/>
+      <w:r>
+        <w:rPr>
+          <w:rFonts w:ascii="Courier New" w:hAnsi="Courier New" w:cs="Courier New"/>
+          <w:sz w:val="18"/>
+          <w:szCs w:val="18"/>
+          <w:lang w:val="en-US"/>
+        </w:rPr>
+        <w:t>(encoding=encoding))</w:t>
       </w:r>
     </w:p>
     <w:p>
@@ -691,7 +1173,27 @@
           <w:szCs w:val="18"/>
           <w:lang w:val="en-US"/>
         </w:rPr>
-        <w:t>FloatList2: list[float] = data["FloatList1"]</w:t>
+        <w:t xml:space="preserve">FloatList2: </w:t>
+      </w:r>
+      <w:proofErr w:type="gramStart"/>
+      <w:r>
+        <w:rPr>
+          <w:rFonts w:ascii="Courier New" w:hAnsi="Courier New" w:cs="Courier New"/>
+          <w:sz w:val="18"/>
+          <w:szCs w:val="18"/>
+          <w:lang w:val="en-US"/>
+        </w:rPr>
+        <w:t>list[</w:t>
+      </w:r>
+      <w:proofErr w:type="gramEnd"/>
+      <w:r>
+        <w:rPr>
+          <w:rFonts w:ascii="Courier New" w:hAnsi="Courier New" w:cs="Courier New"/>
+          <w:sz w:val="18"/>
+          <w:szCs w:val="18"/>
+          <w:lang w:val="en-US"/>
+        </w:rPr>
+        <w:t>float] = data["FloatList1"]</w:t>
       </w:r>
     </w:p>
     <w:p>
@@ -743,7 +1245,89 @@
           <w:szCs w:val="18"/>
           <w:lang w:val="en-US"/>
         </w:rPr>
-        <w:t>    num for num in FloatList2 if num != max(FloatList2) and num != min(FloatList2)</w:t>
+        <w:t xml:space="preserve">    </w:t>
+      </w:r>
+      <w:proofErr w:type="spellStart"/>
+      <w:proofErr w:type="gramStart"/>
+      <w:r>
+        <w:rPr>
+          <w:rFonts w:ascii="Courier New" w:hAnsi="Courier New" w:cs="Courier New"/>
+          <w:sz w:val="18"/>
+          <w:szCs w:val="18"/>
+          <w:lang w:val="en-US"/>
+        </w:rPr>
+        <w:t>num</w:t>
+      </w:r>
+      <w:proofErr w:type="spellEnd"/>
+      <w:proofErr w:type="gramEnd"/>
+      <w:r>
+        <w:rPr>
+          <w:rFonts w:ascii="Courier New" w:hAnsi="Courier New" w:cs="Courier New"/>
+          <w:sz w:val="18"/>
+          <w:szCs w:val="18"/>
+          <w:lang w:val="en-US"/>
+        </w:rPr>
+        <w:t xml:space="preserve"> for </w:t>
+      </w:r>
+      <w:proofErr w:type="spellStart"/>
+      <w:r>
+        <w:rPr>
+          <w:rFonts w:ascii="Courier New" w:hAnsi="Courier New" w:cs="Courier New"/>
+          <w:sz w:val="18"/>
+          <w:szCs w:val="18"/>
+          <w:lang w:val="en-US"/>
+        </w:rPr>
+        <w:t>num</w:t>
+      </w:r>
+      <w:proofErr w:type="spellEnd"/>
+      <w:r>
+        <w:rPr>
+          <w:rFonts w:ascii="Courier New" w:hAnsi="Courier New" w:cs="Courier New"/>
+          <w:sz w:val="18"/>
+          <w:szCs w:val="18"/>
+          <w:lang w:val="en-US"/>
+        </w:rPr>
+        <w:t xml:space="preserve"> in FloatList2 if </w:t>
+      </w:r>
+      <w:proofErr w:type="spellStart"/>
+      <w:r>
+        <w:rPr>
+          <w:rFonts w:ascii="Courier New" w:hAnsi="Courier New" w:cs="Courier New"/>
+          <w:sz w:val="18"/>
+          <w:szCs w:val="18"/>
+          <w:lang w:val="en-US"/>
+        </w:rPr>
+        <w:t>num</w:t>
+      </w:r>
+      <w:proofErr w:type="spellEnd"/>
+      <w:r>
+        <w:rPr>
+          <w:rFonts w:ascii="Courier New" w:hAnsi="Courier New" w:cs="Courier New"/>
+          <w:sz w:val="18"/>
+          <w:szCs w:val="18"/>
+          <w:lang w:val="en-US"/>
+        </w:rPr>
+        <w:t xml:space="preserve"> != max(FloatList2) and </w:t>
+      </w:r>
+      <w:proofErr w:type="spellStart"/>
+      <w:r>
+        <w:rPr>
+          <w:rFonts w:ascii="Courier New" w:hAnsi="Courier New" w:cs="Courier New"/>
+          <w:sz w:val="18"/>
+          <w:szCs w:val="18"/>
+          <w:lang w:val="en-US"/>
+        </w:rPr>
+        <w:t>num</w:t>
+      </w:r>
+      <w:proofErr w:type="spellEnd"/>
+      <w:r>
+        <w:rPr>
+          <w:rFonts w:ascii="Courier New" w:hAnsi="Courier New" w:cs="Courier New"/>
+          <w:sz w:val="18"/>
+          <w:szCs w:val="18"/>
+          <w:lang w:val="en-US"/>
+        </w:rPr>
+        <w:t xml:space="preserve"> != min(FloatList2)</w:t>
       </w:r>
     </w:p>
     <w:p>
@@ -805,14 +1389,25 @@
           <w:lang w:val="en-US"/>
         </w:rPr>
       </w:pPr>
-      <w:r>
-        <w:rPr>
-          <w:rFonts w:ascii="Courier New" w:hAnsi="Courier New" w:cs="Courier New"/>
-          <w:sz w:val="18"/>
-          <w:szCs w:val="18"/>
-          <w:lang w:val="en-US"/>
-        </w:rPr>
-        <w:t>data["FloatList2"] = FloatList2</w:t>
+      <w:proofErr w:type="gramStart"/>
+      <w:r>
+        <w:rPr>
+          <w:rFonts w:ascii="Courier New" w:hAnsi="Courier New" w:cs="Courier New"/>
+          <w:sz w:val="18"/>
+          <w:szCs w:val="18"/>
+          <w:lang w:val="en-US"/>
+        </w:rPr>
+        <w:t>data[</w:t>
+      </w:r>
+      <w:proofErr w:type="gramEnd"/>
+      <w:r>
+        <w:rPr>
+          <w:rFonts w:ascii="Courier New" w:hAnsi="Courier New" w:cs="Courier New"/>
+          <w:sz w:val="18"/>
+          <w:szCs w:val="18"/>
+          <w:lang w:val="en-US"/>
+        </w:rPr>
+        <w:t>"FloatList2"] = FloatList2</w:t>
       </w:r>
     </w:p>
     <w:p>
@@ -831,14 +1426,56 @@
           <w:lang w:val="en-US"/>
         </w:rPr>
       </w:pPr>
-      <w:r>
-        <w:rPr>
-          <w:rFonts w:ascii="Courier New" w:hAnsi="Courier New" w:cs="Courier New"/>
-          <w:sz w:val="18"/>
-          <w:szCs w:val="18"/>
-          <w:lang w:val="en-US"/>
-        </w:rPr>
-        <w:t>file_path.write_text(json.dumps(data, indent=2))</w:t>
+      <w:proofErr w:type="spellStart"/>
+      <w:r>
+        <w:rPr>
+          <w:rFonts w:ascii="Courier New" w:hAnsi="Courier New" w:cs="Courier New"/>
+          <w:sz w:val="18"/>
+          <w:szCs w:val="18"/>
+          <w:lang w:val="en-US"/>
+        </w:rPr>
+        <w:t>file_path.write_</w:t>
+      </w:r>
+      <w:proofErr w:type="gramStart"/>
+      <w:r>
+        <w:rPr>
+          <w:rFonts w:ascii="Courier New" w:hAnsi="Courier New" w:cs="Courier New"/>
+          <w:sz w:val="18"/>
+          <w:szCs w:val="18"/>
+          <w:lang w:val="en-US"/>
+        </w:rPr>
+        <w:t>text</w:t>
+      </w:r>
+      <w:proofErr w:type="spellEnd"/>
+      <w:r>
+        <w:rPr>
+          <w:rFonts w:ascii="Courier New" w:hAnsi="Courier New" w:cs="Courier New"/>
+          <w:sz w:val="18"/>
+          <w:szCs w:val="18"/>
+          <w:lang w:val="en-US"/>
+        </w:rPr>
+        <w:t>(</w:t>
+      </w:r>
+      <w:proofErr w:type="spellStart"/>
+      <w:proofErr w:type="gramEnd"/>
+      <w:r>
+        <w:rPr>
+          <w:rFonts w:ascii="Courier New" w:hAnsi="Courier New" w:cs="Courier New"/>
+          <w:sz w:val="18"/>
+          <w:szCs w:val="18"/>
+          <w:lang w:val="en-US"/>
+        </w:rPr>
+        <w:t>json.dumps</w:t>
+      </w:r>
+      <w:proofErr w:type="spellEnd"/>
+      <w:r>
+        <w:rPr>
+          <w:rFonts w:ascii="Courier New" w:hAnsi="Courier New" w:cs="Courier New"/>
+          <w:sz w:val="18"/>
+          <w:szCs w:val="18"/>
+          <w:lang w:val="en-US"/>
+        </w:rPr>
+        <w:t>(data, indent=2))</w:t>
       </w:r>
     </w:p>
     <w:p>
@@ -874,6 +1511,7 @@
           <w:lang w:val="en-US"/>
         </w:rPr>
       </w:pPr>
+      <w:proofErr w:type="gramStart"/>
       <w:r>
         <w:rPr>
           <w:rFonts w:ascii="Courier New" w:hAnsi="Courier New" w:cs="Courier New"/>
@@ -883,6 +1521,7 @@
         </w:rPr>
         <w:t>print(</w:t>
       </w:r>
+      <w:proofErr w:type="gramEnd"/>
     </w:p>
     <w:p>
       <w:pPr>
@@ -907,7 +1546,27 @@
           <w:szCs w:val="18"/>
           <w:lang w:val="en-US"/>
         </w:rPr>
-        <w:t>    f"""</w:t>
+        <w:t xml:space="preserve">    </w:t>
+      </w:r>
+      <w:proofErr w:type="gramStart"/>
+      <w:r>
+        <w:rPr>
+          <w:rFonts w:ascii="Courier New" w:hAnsi="Courier New" w:cs="Courier New"/>
+          <w:sz w:val="18"/>
+          <w:szCs w:val="18"/>
+          <w:lang w:val="en-US"/>
+        </w:rPr>
+        <w:t>f</w:t>
+      </w:r>
+      <w:proofErr w:type="gramEnd"/>
+      <w:r>
+        <w:rPr>
+          <w:rFonts w:ascii="Courier New" w:hAnsi="Courier New" w:cs="Courier New"/>
+          <w:sz w:val="18"/>
+          <w:szCs w:val="18"/>
+          <w:lang w:val="en-US"/>
+        </w:rPr>
+        <w:t>"""</w:t>
       </w:r>
     </w:p>
     <w:p>
@@ -959,7 +1618,27 @@
           <w:szCs w:val="18"/>
           <w:lang w:val="en-US"/>
         </w:rPr>
-        <w:t>Max value = {max(FloatList1)} and Min value = {min(FloatList1)} removed</w:t>
+        <w:t>Max value = {</w:t>
+      </w:r>
+      <w:proofErr w:type="gramStart"/>
+      <w:r>
+        <w:rPr>
+          <w:rFonts w:ascii="Courier New" w:hAnsi="Courier New" w:cs="Courier New"/>
+          <w:sz w:val="18"/>
+          <w:szCs w:val="18"/>
+          <w:lang w:val="en-US"/>
+        </w:rPr>
+        <w:t>max(</w:t>
+      </w:r>
+      <w:proofErr w:type="gramEnd"/>
+      <w:r>
+        <w:rPr>
+          <w:rFonts w:ascii="Courier New" w:hAnsi="Courier New" w:cs="Courier New"/>
+          <w:sz w:val="18"/>
+          <w:szCs w:val="18"/>
+          <w:lang w:val="en-US"/>
+        </w:rPr>
+        <w:t>FloatList1)} and Min value = {min(FloatList1)} removed</w:t>
       </w:r>
     </w:p>
     <w:p>
@@ -1001,17 +1680,43 @@
           <w:rFonts w:ascii="Courier New" w:hAnsi="Courier New" w:cs="Courier New"/>
           <w:sz w:val="18"/>
           <w:szCs w:val="18"/>
-          <w:lang w:val="en-US"/>
-        </w:rPr>
-      </w:pPr>
-      <w:r>
-        <w:rPr>
-          <w:rFonts w:ascii="Courier New" w:hAnsi="Courier New" w:cs="Courier New"/>
-          <w:sz w:val="18"/>
-          <w:szCs w:val="18"/>
-          <w:lang w:val="en-US"/>
-        </w:rPr>
-        <w:t>    """.strip()</w:t>
+        </w:rPr>
+      </w:pPr>
+      <w:r>
+        <w:rPr>
+          <w:rFonts w:ascii="Courier New" w:hAnsi="Courier New" w:cs="Courier New"/>
+          <w:sz w:val="18"/>
+          <w:szCs w:val="18"/>
+          <w:lang w:val="en-US"/>
+        </w:rPr>
+        <w:t xml:space="preserve">    </w:t>
+      </w:r>
+      <w:r>
+        <w:rPr>
+          <w:rFonts w:ascii="Courier New" w:hAnsi="Courier New" w:cs="Courier New"/>
+          <w:sz w:val="18"/>
+          <w:szCs w:val="18"/>
+        </w:rPr>
+        <w:t>""".</w:t>
+      </w:r>
+      <w:proofErr w:type="gramStart"/>
+      <w:r>
+        <w:rPr>
+          <w:rFonts w:ascii="Courier New" w:hAnsi="Courier New" w:cs="Courier New"/>
+          <w:sz w:val="18"/>
+          <w:szCs w:val="18"/>
+          <w:lang w:val="en-US"/>
+        </w:rPr>
+        <w:t>strip</w:t>
+      </w:r>
+      <w:proofErr w:type="gramEnd"/>
+      <w:r>
+        <w:rPr>
+          <w:rFonts w:ascii="Courier New" w:hAnsi="Courier New" w:cs="Courier New"/>
+          <w:sz w:val="18"/>
+          <w:szCs w:val="18"/>
+        </w:rPr>
+        <w:t>()</w:t>
       </w:r>
     </w:p>
     <w:p>
@@ -1027,15 +1732,13 @@
           <w:rFonts w:ascii="Courier New" w:hAnsi="Courier New" w:cs="Courier New"/>
           <w:sz w:val="18"/>
           <w:szCs w:val="18"/>
-          <w:lang w:val="en-US"/>
-        </w:rPr>
-      </w:pPr>
-      <w:r>
-        <w:rPr>
-          <w:rFonts w:ascii="Courier New" w:hAnsi="Courier New" w:cs="Courier New"/>
-          <w:sz w:val="18"/>
-          <w:szCs w:val="18"/>
-          <w:lang w:val="en-US"/>
+        </w:rPr>
+      </w:pPr>
+      <w:r>
+        <w:rPr>
+          <w:rFonts w:ascii="Courier New" w:hAnsi="Courier New" w:cs="Courier New"/>
+          <w:sz w:val="18"/>
+          <w:szCs w:val="18"/>
         </w:rPr>
         <w:t>)</w:t>
       </w:r>
@@ -1137,7 +1840,6 @@
           <w:b/>
           <w:bCs/>
           <w:noProof/>
-          <w:lang w:val="en-US"/>
         </w:rPr>
         <w:t>[</w:t>
       </w:r>
@@ -1191,6 +1893,7 @@
           <w:noProof/>
           <w:sz w:val="32"/>
           <w:szCs w:val="32"/>
+          <w:lang w:eastAsia="ru-RU"/>
         </w:rPr>
         <w:drawing>
           <wp:inline distT="0" distB="0" distL="0" distR="0" wp14:anchorId="47AD6D99" wp14:editId="7CDB2347">
@@ -1253,7 +1956,7 @@
 </file>
 
 <file path=word/styles.xml><?xml version="1.0" encoding="utf-8"?>
-<w:styles xmlns:mc="http://schemas.openxmlformats.org/markup-compatibility/2006" xmlns:r="http://schemas.openxmlformats.org/officeDocument/2006/relationships" xmlns:w="http://schemas.openxmlformats.org/wordprocessingml/2006/main" xmlns:w14="http://schemas.microsoft.com/office/word/2010/wordml" xmlns:w15="http://schemas.microsoft.com/office/word/2012/wordml" xmlns:w16cex="http://schemas.microsoft.com/office/word/2018/wordml/cex" xmlns:w16cid="http://schemas.microsoft.com/office/word/2016/wordml/cid" xmlns:w16="http://schemas.microsoft.com/office/word/2018/wordml" xmlns:w16du="http://schemas.microsoft.com/office/word/2023/wordml/word16du" xmlns:w16sdtdh="http://schemas.microsoft.com/office/word/2020/wordml/sdtdatahash" xmlns:w16sdtfl="http://schemas.microsoft.com/office/word/2024/wordml/sdtformatlock" xmlns:w16se="http://schemas.microsoft.com/office/word/2015/wordml/symex" mc:Ignorable="w14 w15 w16se w16cid w16 w16cex w16sdtdh w16sdtfl w16du">
+<w:styles xmlns:mc="http://schemas.openxmlformats.org/markup-compatibility/2006" xmlns:r="http://schemas.openxmlformats.org/officeDocument/2006/relationships" xmlns:w="http://schemas.openxmlformats.org/wordprocessingml/2006/main" xmlns:w14="http://schemas.microsoft.com/office/word/2010/wordml" xmlns:w15="http://schemas.microsoft.com/office/word/2012/wordml" xmlns:w16se="http://schemas.microsoft.com/office/word/2015/wordml/symex" mc:Ignorable="w14 w15 w16se">
   <w:docDefaults>
     <w:rPrDefault>
       <w:rPr>
@@ -1271,7 +1974,7 @@
       </w:pPr>
     </w:pPrDefault>
   </w:docDefaults>
-  <w:latentStyles w:defLockedState="0" w:defUIPriority="99" w:defSemiHidden="0" w:defUnhideWhenUsed="0" w:defQFormat="0" w:count="376">
+  <w:latentStyles w:defLockedState="0" w:defUIPriority="99" w:defSemiHidden="0" w:defUnhideWhenUsed="0" w:defQFormat="0" w:count="371">
     <w:lsdException w:name="Normal" w:uiPriority="0" w:qFormat="1"/>
     <w:lsdException w:name="heading 1" w:uiPriority="9" w:qFormat="1"/>
     <w:lsdException w:name="heading 2" w:semiHidden="1" w:uiPriority="9" w:unhideWhenUsed="1" w:qFormat="1"/>
@@ -1643,11 +2346,6 @@
     <w:lsdException w:name="List Table 5 Dark Accent 6" w:uiPriority="50"/>
     <w:lsdException w:name="List Table 6 Colorful Accent 6" w:uiPriority="51"/>
     <w:lsdException w:name="List Table 7 Colorful Accent 6" w:uiPriority="52"/>
-    <w:lsdException w:name="Mention" w:semiHidden="1" w:unhideWhenUsed="1"/>
-    <w:lsdException w:name="Smart Hyperlink" w:semiHidden="1" w:unhideWhenUsed="1"/>
-    <w:lsdException w:name="Hashtag" w:semiHidden="1" w:unhideWhenUsed="1"/>
-    <w:lsdException w:name="Unresolved Mention" w:semiHidden="1" w:unhideWhenUsed="1"/>
-    <w:lsdException w:name="Smart Link" w:semiHidden="1" w:unhideWhenUsed="1"/>
   </w:latentStyles>
   <w:style w:type="paragraph" w:default="1" w:styleId="a">
     <w:name w:val="Normal"/>
@@ -1856,6 +2554,7 @@
   <w:style w:type="character" w:default="1" w:styleId="a0">
     <w:name w:val="Default Paragraph Font"/>
     <w:uiPriority w:val="1"/>
+    <w:semiHidden/>
     <w:unhideWhenUsed/>
   </w:style>
   <w:style w:type="table" w:default="1" w:styleId="a1">

</xml_diff>